<commit_message>
Kim12-2-8-Alifatik-Hidrokarbonlarin-Ozellikleri: gorsel alanlarina Shutter onizlemeleri yerlestirildi (2.3 bicimi)
</commit_message>
<xml_diff>
--- a/Kim12-2-8-Alifatik-Hidrokarbonlarin-Ozellikleri.docx
+++ b/Kim12-2-8-Alifatik-Hidrokarbonlarin-Ozellikleri.docx
@@ -39,99 +39,73 @@
         <w:t xml:space="preserve">Doğal gazın büyük bölümünü oluşturan metan boru hatlarıyla gaz hâlinde taşınırken benzindeki hidrokarbonlar oda sıcaklığında sıvıdır, mumun yapıldığı parafin ise katıdır. Hepsi yalnızca karbon ve hidrojen atomlarından oluşan bu maddelerin fiziksel hâlleri neden bu kadar farklıdır? Öte yandan metal kesme ve kaynak işlerinde etin (asetilen) gazı kullanılır (Görsel A); market poşetlerinden su borularına kadar pek çok üründe ise etenden (etilen) üretilen polietilen bulunur (Görsel B). Benzer kimyasal türlerden oluşan bu bileşiklerin bazıları yalnızca yakıt olarak kullanılırken bazıları neden plastik üretiminde ham madde olarak tercih edilir? Alifatik hidrokarbonların hangi özellikleri benzer, hangileri farklıdır?</w:t>
       </w:r>
     </w:p>
-    <w:tbl>
-      <w:tblPr>
-        <w:tblW w:w="9000" w:type="dxa"/>
+    <w:p>
+      <w:pPr>
         <w:jc w:val="center"/>
-        <w:tblBorders>
-          <w:top w:val="single" w:sz="8" w:space="0" w:color="7F7F7F"/>
-          <w:left w:val="single" w:sz="8" w:space="0" w:color="7F7F7F"/>
-          <w:bottom w:val="single" w:sz="8" w:space="0" w:color="7F7F7F"/>
-          <w:right w:val="single" w:sz="8" w:space="0" w:color="7F7F7F"/>
-        </w:tblBorders>
-      </w:tblPr>
-      <w:tblGrid>
-        <w:gridCol w:w="9000"/>
-      </w:tblGrid>
-      <w:tr>
-        <w:tc>
-          <w:tcPr>
-            <w:tcW w:w="9000" w:type="dxa"/>
-            <w:shd w:val="clear" w:color="auto" w:fill="EDEDED"/>
-          </w:tcPr>
-          <w:p>
-            <w:pPr>
-              <w:jc w:val="both"/>
-              <w:rPr>
-                <w:rFonts w:ascii="Times New Roman" w:hAnsi="Times New Roman" w:cs="Times New Roman"/>
-                <w:lang w:val="tr-TR"/>
-              </w:rPr>
-            </w:pPr>
-            <w:r>
-              <w:rPr>
-                <w:rFonts w:ascii="Times New Roman" w:hAnsi="Times New Roman" w:cs="Times New Roman"/>
-                <w:lang w:val="tr-TR"/>
-              </w:rPr>
-              <w:t xml:space="preserve">GÖRSEL ALANI (Shutterstock)</w:t>
-            </w:r>
-          </w:p>
-          <w:p>
-            <w:pPr>
-              <w:jc w:val="both"/>
-              <w:rPr>
-                <w:rFonts w:ascii="Times New Roman" w:hAnsi="Times New Roman" w:cs="Times New Roman"/>
-                <w:lang w:val="tr-TR"/>
-              </w:rPr>
-            </w:pPr>
-            <w:r>
-              <w:rPr>
-                <w:rFonts w:ascii="Times New Roman" w:hAnsi="Times New Roman" w:cs="Times New Roman"/>
-                <w:lang w:val="tr-TR"/>
-              </w:rPr>
-              <w:t xml:space="preserve">Tarif: Koruyucu maske ve eldiven takmış bir kaynak ustasının oksi-asetilen şalomasıyla metal kesmesi; kıvılcımlar görünüyor, marka ve logo görünmesin.</w:t>
-            </w:r>
-          </w:p>
-          <w:p>
-            <w:pPr>
-              <w:jc w:val="both"/>
-              <w:rPr>
-                <w:rFonts w:ascii="Times New Roman" w:hAnsi="Times New Roman" w:cs="Times New Roman"/>
-                <w:lang w:val="tr-TR"/>
-              </w:rPr>
-            </w:pPr>
-            <w:r>
-              <w:rPr>
-                <w:rFonts w:ascii="Times New Roman" w:hAnsi="Times New Roman" w:cs="Times New Roman"/>
-                <w:lang w:val="tr-TR"/>
-              </w:rPr>
-              <w:t xml:space="preserve">Shutter ID: 1589002777 (fotoğraf) — Oxyacetylene cutting of steel</w:t>
-            </w:r>
-          </w:p>
-        </w:tc>
-      </w:tr>
-    </w:tbl>
-    <w:p>
-      <w:pPr>
-        <w:jc w:val="both"/>
-        <w:rPr>
-          <w:rFonts w:ascii="Times New Roman" w:hAnsi="Times New Roman" w:cs="Times New Roman"/>
-          <w:lang w:val="tr-TR"/>
-        </w:rPr>
-      </w:pPr>
+      </w:pPr>
+      <w:r>
+        <w:drawing>
+          <wp:inline xmlns:a="http://schemas.openxmlformats.org/drawingml/2006/main" xmlns:pic="http://schemas.openxmlformats.org/drawingml/2006/picture">
+            <wp:extent cx="3433242" cy="2520000"/>
+            <wp:docPr id="900013" name="Picture 900013"/>
+            <wp:cNvGraphicFramePr>
+              <a:graphicFrameLocks noChangeAspect="1"/>
+            </wp:cNvGraphicFramePr>
+            <a:graphic>
+              <a:graphicData uri="http://schemas.openxmlformats.org/drawingml/2006/picture">
+                <pic:pic>
+                  <pic:nvPicPr>
+                    <pic:cNvPr id="0" name="1589002777_d.jpg"/>
+                    <pic:cNvPicPr/>
+                  </pic:nvPicPr>
+                  <pic:blipFill>
+                    <a:blip r:embed="rId11"/>
+                    <a:stretch>
+                      <a:fillRect/>
+                    </a:stretch>
+                  </pic:blipFill>
+                  <pic:spPr>
+                    <a:xfrm>
+                      <a:off x="0" y="0"/>
+                      <a:ext cx="3433242" cy="2520000"/>
+                    </a:xfrm>
+                    <a:prstGeom prst="rect"/>
+                  </pic:spPr>
+                </pic:pic>
+              </a:graphicData>
+            </a:graphic>
+          </wp:inline>
+        </w:drawing>
+      </w:r>
     </w:p>
     <w:p>
       <w:pPr>
         <w:jc w:val="center"/>
-        <w:rPr>
-          <w:rFonts w:ascii="Times New Roman" w:hAnsi="Times New Roman" w:cs="Times New Roman"/>
-          <w:lang w:val="tr-TR"/>
-        </w:rPr>
       </w:pPr>
       <w:r>
         <w:rPr>
           <w:rFonts w:ascii="Times New Roman" w:hAnsi="Times New Roman" w:cs="Times New Roman"/>
           <w:b/>
           <w:bCs/>
+          <w:highlight w:val="yellow"/>
+          <w:lang w:val="tr-TR"/>
+        </w:rPr>
+        <w:t xml:space="preserve">Shutter id: 1589002777</w:t>
+      </w:r>
+    </w:p>
+    <w:p>
+      <w:pPr>
+        <w:jc w:val="center"/>
+        <w:rPr>
+          <w:rFonts w:ascii="Times New Roman" w:hAnsi="Times New Roman" w:cs="Times New Roman"/>
+          <w:lang w:val="tr-TR"/>
+        </w:rPr>
+      </w:pPr>
+      <w:r>
+        <w:rPr>
+          <w:rFonts w:ascii="Times New Roman" w:hAnsi="Times New Roman" w:cs="Times New Roman"/>
+          <w:b/>
+          <w:bCs/>
           <w:lang w:val="tr-TR"/>
         </w:rPr>
         <w:t xml:space="preserve">Görsel A:</w:t>
@@ -144,85 +118,59 @@
         <w:t xml:space="preserve"> Oksi-asetilen kaynağı</w:t>
       </w:r>
     </w:p>
-    <w:tbl>
-      <w:tblPr>
-        <w:tblW w:w="9000" w:type="dxa"/>
+    <w:p>
+      <w:pPr>
         <w:jc w:val="center"/>
-        <w:tblBorders>
-          <w:top w:val="single" w:sz="8" w:space="0" w:color="7F7F7F"/>
-          <w:left w:val="single" w:sz="8" w:space="0" w:color="7F7F7F"/>
-          <w:bottom w:val="single" w:sz="8" w:space="0" w:color="7F7F7F"/>
-          <w:right w:val="single" w:sz="8" w:space="0" w:color="7F7F7F"/>
-        </w:tblBorders>
-      </w:tblPr>
-      <w:tblGrid>
-        <w:gridCol w:w="9000"/>
-      </w:tblGrid>
-      <w:tr>
-        <w:tc>
-          <w:tcPr>
-            <w:tcW w:w="9000" w:type="dxa"/>
-            <w:shd w:val="clear" w:color="auto" w:fill="EDEDED"/>
-          </w:tcPr>
-          <w:p>
-            <w:pPr>
-              <w:jc w:val="both"/>
-              <w:rPr>
-                <w:rFonts w:ascii="Times New Roman" w:hAnsi="Times New Roman" w:cs="Times New Roman"/>
-                <w:lang w:val="tr-TR"/>
-              </w:rPr>
-            </w:pPr>
-            <w:r>
-              <w:rPr>
-                <w:rFonts w:ascii="Times New Roman" w:hAnsi="Times New Roman" w:cs="Times New Roman"/>
-                <w:lang w:val="tr-TR"/>
-              </w:rPr>
-              <w:t xml:space="preserve">GÖRSEL ALANI (Shutterstock)</w:t>
-            </w:r>
-          </w:p>
-          <w:p>
-            <w:pPr>
-              <w:jc w:val="both"/>
-              <w:rPr>
-                <w:rFonts w:ascii="Times New Roman" w:hAnsi="Times New Roman" w:cs="Times New Roman"/>
-                <w:lang w:val="tr-TR"/>
-              </w:rPr>
-            </w:pPr>
-            <w:r>
-              <w:rPr>
-                <w:rFonts w:ascii="Times New Roman" w:hAnsi="Times New Roman" w:cs="Times New Roman"/>
-                <w:lang w:val="tr-TR"/>
-              </w:rPr>
-              <w:t xml:space="preserve">Tarif: Polietilenden yapılmış ürünler: rulo hâlinde streç film, renkli plastik su boruları ve şeffaf poşetler; marka ve logo görünmesin.</w:t>
-            </w:r>
-          </w:p>
-          <w:p>
-            <w:pPr>
-              <w:jc w:val="both"/>
-              <w:rPr>
-                <w:rFonts w:ascii="Times New Roman" w:hAnsi="Times New Roman" w:cs="Times New Roman"/>
-                <w:lang w:val="tr-TR"/>
-              </w:rPr>
-            </w:pPr>
-            <w:r>
-              <w:rPr>
-                <w:rFonts w:ascii="Times New Roman" w:hAnsi="Times New Roman" w:cs="Times New Roman"/>
-                <w:lang w:val="tr-TR"/>
-              </w:rPr>
-              <w:t xml:space="preserve">Shutter ID: 2845635703 (fotoğraf) — Polyethylene pipes</w:t>
-            </w:r>
-          </w:p>
-        </w:tc>
-      </w:tr>
-    </w:tbl>
+      </w:pPr>
+      <w:r>
+        <w:drawing>
+          <wp:inline xmlns:a="http://schemas.openxmlformats.org/drawingml/2006/main" xmlns:pic="http://schemas.openxmlformats.org/drawingml/2006/picture">
+            <wp:extent cx="4660912" cy="2520000"/>
+            <wp:docPr id="900014" name="Picture 900014"/>
+            <wp:cNvGraphicFramePr>
+              <a:graphicFrameLocks noChangeAspect="1"/>
+            </wp:cNvGraphicFramePr>
+            <a:graphic>
+              <a:graphicData uri="http://schemas.openxmlformats.org/drawingml/2006/picture">
+                <pic:pic>
+                  <pic:nvPicPr>
+                    <pic:cNvPr id="0" name="2845635703_d.jpg"/>
+                    <pic:cNvPicPr/>
+                  </pic:nvPicPr>
+                  <pic:blipFill>
+                    <a:blip r:embed="rId12"/>
+                    <a:stretch>
+                      <a:fillRect/>
+                    </a:stretch>
+                  </pic:blipFill>
+                  <pic:spPr>
+                    <a:xfrm>
+                      <a:off x="0" y="0"/>
+                      <a:ext cx="4660912" cy="2520000"/>
+                    </a:xfrm>
+                    <a:prstGeom prst="rect"/>
+                  </pic:spPr>
+                </pic:pic>
+              </a:graphicData>
+            </a:graphic>
+          </wp:inline>
+        </w:drawing>
+      </w:r>
+    </w:p>
     <w:p>
       <w:pPr>
-        <w:jc w:val="both"/>
-        <w:rPr>
-          <w:rFonts w:ascii="Times New Roman" w:hAnsi="Times New Roman" w:cs="Times New Roman"/>
-          <w:lang w:val="tr-TR"/>
-        </w:rPr>
-      </w:pPr>
+        <w:jc w:val="center"/>
+      </w:pPr>
+      <w:r>
+        <w:rPr>
+          <w:rFonts w:ascii="Times New Roman" w:hAnsi="Times New Roman" w:cs="Times New Roman"/>
+          <w:b/>
+          <w:bCs/>
+          <w:highlight w:val="yellow"/>
+          <w:lang w:val="tr-TR"/>
+        </w:rPr>
+        <w:t xml:space="preserve">Shutter id: 2845635703</w:t>
+      </w:r>
     </w:p>
     <w:p>
       <w:pPr>

</xml_diff>